<commit_message>
Study design worksheet notes from class
</commit_message>
<xml_diff>
--- a/In Class Worksheet/Study Design Worksheet #1.docx
+++ b/In Class Worksheet/Study Design Worksheet #1.docx
@@ -4,6 +4,72 @@
   <w:body>
     <w:p>
       <w:pPr>
+        <w:rPr>
+          <w:rFonts w:ascii="Arial" w:hAnsi="Arial" w:cs="Arial"/>
+          <w:b/>
+        </w:rPr>
+      </w:pPr>
+      <w:r>
+        <w:rPr>
+          <w:rFonts w:ascii="Arial" w:hAnsi="Arial" w:cs="Arial"/>
+          <w:b/>
+        </w:rPr>
+        <w:t>Name: Aimee Steinwand</w:t>
+      </w:r>
+    </w:p>
+    <w:p>
+      <w:pPr>
+        <w:rPr>
+          <w:rFonts w:ascii="Arial" w:hAnsi="Arial" w:cs="Arial"/>
+          <w:b/>
+        </w:rPr>
+      </w:pPr>
+      <w:r>
+        <w:rPr>
+          <w:rFonts w:ascii="Arial" w:hAnsi="Arial" w:cs="Arial"/>
+          <w:b/>
+        </w:rPr>
+        <w:t>Group</w:t>
+      </w:r>
+      <w:r>
+        <w:rPr>
+          <w:rFonts w:ascii="Arial" w:hAnsi="Arial" w:cs="Arial"/>
+          <w:b/>
+        </w:rPr>
+        <w:t xml:space="preserve"> 5</w:t>
+      </w:r>
+      <w:r>
+        <w:rPr>
+          <w:rFonts w:ascii="Arial" w:hAnsi="Arial" w:cs="Arial"/>
+          <w:b/>
+        </w:rPr>
+        <w:t>: Maddie, Yemi</w:t>
+      </w:r>
+    </w:p>
+    <w:p>
+      <w:pPr>
+        <w:rPr>
+          <w:rFonts w:ascii="Arial" w:hAnsi="Arial" w:cs="Arial"/>
+          <w:b/>
+        </w:rPr>
+      </w:pPr>
+      <w:r>
+        <w:rPr>
+          <w:rFonts w:ascii="Arial" w:hAnsi="Arial" w:cs="Arial"/>
+          <w:b/>
+        </w:rPr>
+        <w:t>** I thought we had to do the entire worksheet</w:t>
+      </w:r>
+      <w:r>
+        <w:rPr>
+          <w:rFonts w:ascii="Arial" w:hAnsi="Arial" w:cs="Arial"/>
+          <w:b/>
+        </w:rPr>
+        <w:t xml:space="preserve"> because previously the worksheets were due before class. Our group was #5.</w:t>
+      </w:r>
+    </w:p>
+    <w:p>
+      <w:pPr>
         <w:jc w:val="center"/>
         <w:rPr>
           <w:rFonts w:ascii="Arial" w:hAnsi="Arial" w:cs="Arial"/>
@@ -449,7 +515,14 @@
         <w:rPr>
           <w:rFonts w:ascii="Arial" w:hAnsi="Arial" w:cs="Arial"/>
         </w:rPr>
-        <w:t>Individuals with chronic lung disease like pulmonary fibrosis have increased levels of a certain mucin, MUC5B, in their bronchial airways.  We think this increased production is related to disease pathogenesis, not a result of the disease process, and are exploring the use of mucolytic compounds in treatment of early-stage disease.  We are using airway epithelial cells, some that over-express MUC5B and others that have normal expression.  We will treat all the cells with the mucolytic compounds to see if treatment results in reduced MUC5B production</w:t>
+        <w:t xml:space="preserve">Individuals with chronic lung disease like pulmonary fibrosis have increased levels of a certain mucin, MUC5B, in their bronchial airways.  We think this increased production is related to disease pathogenesis, not a result of the disease process, and are exploring the use of mucolytic compounds in treatment of early-stage disease.  We are using airway epithelial cells, some that over-express MUC5B and others that have normal </w:t>
+      </w:r>
+      <w:r>
+        <w:rPr>
+          <w:rFonts w:ascii="Arial" w:hAnsi="Arial" w:cs="Arial"/>
+        </w:rPr>
+        <w:lastRenderedPageBreak/>
+        <w:t>expression.  We will treat all the cells with the mucolytic compounds to see if treatment results in reduced MUC5B production</w:t>
       </w:r>
       <w:r>
         <w:rPr>
@@ -522,8 +595,489 @@
           <w:rFonts w:ascii="Arial" w:hAnsi="Arial" w:cs="Arial"/>
           <w:color w:val="4F81BD" w:themeColor="accent1"/>
         </w:rPr>
+        <w:t>What is the unit of measurement</w:t>
+      </w:r>
+      <w:r>
+        <w:rPr>
+          <w:rFonts w:ascii="Arial" w:hAnsi="Arial" w:cs="Arial"/>
+          <w:color w:val="4F81BD" w:themeColor="accent1"/>
+        </w:rPr>
+        <w:t>:</w:t>
+      </w:r>
+      <w:r>
+        <w:rPr>
+          <w:rFonts w:ascii="Arial" w:hAnsi="Arial" w:cs="Arial"/>
+          <w:color w:val="4F81BD" w:themeColor="accent1"/>
+        </w:rPr>
+        <w:t xml:space="preserve"> individual cells, cell culture wells, or experiments?</w:t>
+      </w:r>
+    </w:p>
+    <w:p>
+      <w:pPr>
+        <w:pStyle w:val="ListParagraph"/>
+        <w:numPr>
+          <w:ilvl w:val="0"/>
+          <w:numId w:val="2"/>
+        </w:numPr>
+        <w:rPr>
+          <w:rFonts w:ascii="Arial" w:hAnsi="Arial" w:cs="Arial"/>
+          <w:color w:val="4F81BD" w:themeColor="accent1"/>
+        </w:rPr>
+      </w:pPr>
+      <w:r>
+        <w:rPr>
+          <w:rFonts w:ascii="Arial" w:hAnsi="Arial" w:cs="Arial"/>
+          <w:color w:val="4F81BD" w:themeColor="accent1"/>
+        </w:rPr>
+        <w:t>How many times will you repeat each experiment?</w:t>
+      </w:r>
+    </w:p>
+    <w:p>
+      <w:pPr>
+        <w:pStyle w:val="ListParagraph"/>
+        <w:numPr>
+          <w:ilvl w:val="0"/>
+          <w:numId w:val="2"/>
+        </w:numPr>
+        <w:rPr>
+          <w:rFonts w:ascii="Arial" w:hAnsi="Arial" w:cs="Arial"/>
+          <w:color w:val="4F81BD" w:themeColor="accent1"/>
+        </w:rPr>
+      </w:pPr>
+      <w:r>
+        <w:rPr>
+          <w:rFonts w:ascii="Arial" w:hAnsi="Arial" w:cs="Arial"/>
+          <w:color w:val="4F81BD" w:themeColor="accent1"/>
+        </w:rPr>
+        <w:t>Will you be looking at dose-response relationships, or a single dose of each compound?</w:t>
+      </w:r>
+    </w:p>
+    <w:p>
+      <w:pPr>
+        <w:pStyle w:val="ListParagraph"/>
+        <w:numPr>
+          <w:ilvl w:val="0"/>
+          <w:numId w:val="2"/>
+        </w:numPr>
+        <w:rPr>
+          <w:rFonts w:ascii="Arial" w:hAnsi="Arial" w:cs="Arial"/>
+          <w:color w:val="4F81BD" w:themeColor="accent1"/>
+        </w:rPr>
+      </w:pPr>
+      <w:r>
+        <w:rPr>
+          <w:rFonts w:ascii="Arial" w:hAnsi="Arial" w:cs="Arial"/>
+          <w:color w:val="4F81BD" w:themeColor="accent1"/>
+        </w:rPr>
+        <w:t>Are you interested in secondary outcomes like cell viability or expression of other mucins, and if so, how should those factor into the sample size?</w:t>
+      </w:r>
+    </w:p>
+    <w:p>
+      <w:pPr>
+        <w:pStyle w:val="ListParagraph"/>
+        <w:rPr>
+          <w:rFonts w:ascii="Arial" w:hAnsi="Arial" w:cs="Arial"/>
+        </w:rPr>
+      </w:pPr>
+    </w:p>
+    <w:p>
+      <w:pPr>
+        <w:pStyle w:val="ListParagraph"/>
+        <w:numPr>
+          <w:ilvl w:val="0"/>
+          <w:numId w:val="1"/>
+        </w:numPr>
+        <w:rPr>
+          <w:rFonts w:ascii="Arial" w:hAnsi="Arial" w:cs="Arial"/>
+          <w:b/>
+        </w:rPr>
+      </w:pPr>
+      <w:r>
+        <w:rPr>
+          <w:rFonts w:ascii="Arial" w:hAnsi="Arial" w:cs="Arial"/>
+          <w:b/>
+        </w:rPr>
+        <w:t>Metabolite predictors of incident type 2 diabetes in Hispanic Americans</w:t>
+      </w:r>
+    </w:p>
+    <w:p>
+      <w:pPr>
+        <w:pStyle w:val="ListParagraph"/>
+        <w:rPr>
+          <w:rFonts w:ascii="Arial" w:hAnsi="Arial" w:cs="Arial"/>
+        </w:rPr>
+      </w:pPr>
+      <w:r>
+        <w:rPr>
+          <w:rFonts w:ascii="Arial" w:hAnsi="Arial" w:cs="Arial"/>
+        </w:rPr>
+        <w:t xml:space="preserve">Insulin resistance and impaired fatty acid metabolism are risk factors for type 2 diabetes.  While several investigators have developed predictive equations for type 2 diabetes risk using insulin resistance measures, much of the variation in risk remains unexplained.  Some small, cross-sectional studies </w:t>
+      </w:r>
+      <w:r>
+        <w:rPr>
+          <w:rFonts w:ascii="Arial" w:hAnsi="Arial" w:cs="Arial"/>
+        </w:rPr>
+        <w:t xml:space="preserve">in European Americans </w:t>
+      </w:r>
+      <w:r>
+        <w:rPr>
+          <w:rFonts w:ascii="Arial" w:hAnsi="Arial" w:cs="Arial"/>
+        </w:rPr>
+        <w:t>have found an association between fatty acid metabolites and type 2 diabe</w:t>
+      </w:r>
+      <w:r>
+        <w:rPr>
+          <w:rFonts w:ascii="Arial" w:hAnsi="Arial" w:cs="Arial"/>
+        </w:rPr>
+        <w:t>tes, but the</w:t>
+      </w:r>
+      <w:r>
+        <w:rPr>
+          <w:rFonts w:ascii="Arial" w:hAnsi="Arial" w:cs="Arial"/>
+        </w:rPr>
+        <w:t xml:space="preserve"> </w:t>
+      </w:r>
+      <w:r>
+        <w:rPr>
+          <w:rFonts w:ascii="Arial" w:hAnsi="Arial" w:cs="Arial"/>
+        </w:rPr>
+        <w:t xml:space="preserve">extent to which fatty acid metabolites predict type 2 diabetes risk in minority populations remains unknown. </w:t>
+      </w:r>
+      <w:r>
+        <w:rPr>
+          <w:rFonts w:ascii="Arial" w:hAnsi="Arial" w:cs="Arial"/>
+        </w:rPr>
+        <w:t xml:space="preserve">To establish an independence of fatty acids from insulin resistance in predicting risk of incident diabetes, we </w:t>
+      </w:r>
+      <w:r>
+        <w:rPr>
+          <w:rFonts w:ascii="Arial" w:hAnsi="Arial" w:cs="Arial"/>
+        </w:rPr>
+        <w:t>propose to evaluate the</w:t>
+      </w:r>
+      <w:r>
+        <w:rPr>
+          <w:rFonts w:ascii="Arial" w:hAnsi="Arial" w:cs="Arial"/>
+        </w:rPr>
+        <w:t xml:space="preserve"> metabolome of a multiethnic cohort free of diabetes at baseline. We </w:t>
+      </w:r>
+      <w:r>
+        <w:rPr>
+          <w:rFonts w:ascii="Arial" w:hAnsi="Arial" w:cs="Arial"/>
+        </w:rPr>
+        <w:t>will also attempt</w:t>
+      </w:r>
+      <w:r>
+        <w:rPr>
+          <w:rFonts w:ascii="Arial" w:hAnsi="Arial" w:cs="Arial"/>
+        </w:rPr>
+        <w:t xml:space="preserve"> to evaluate if </w:t>
+      </w:r>
+      <w:r>
+        <w:rPr>
+          <w:rFonts w:ascii="Arial" w:hAnsi="Arial" w:cs="Arial"/>
+        </w:rPr>
+        <w:t>groups of metabolites</w:t>
+      </w:r>
+      <w:r>
+        <w:rPr>
+          <w:rFonts w:ascii="Arial" w:hAnsi="Arial" w:cs="Arial"/>
+        </w:rPr>
+        <w:t xml:space="preserve"> </w:t>
+      </w:r>
+      <w:r>
+        <w:rPr>
+          <w:rFonts w:ascii="Arial" w:hAnsi="Arial" w:cs="Arial"/>
+        </w:rPr>
+        <w:t>differ</w:t>
+      </w:r>
+      <w:r>
+        <w:rPr>
+          <w:rFonts w:ascii="Arial" w:hAnsi="Arial" w:cs="Arial"/>
+        </w:rPr>
+        <w:t xml:space="preserve"> among different race/ethnicities and genders and whether the association</w:t>
+      </w:r>
+      <w:r>
+        <w:rPr>
+          <w:rFonts w:ascii="Arial" w:hAnsi="Arial" w:cs="Arial"/>
+        </w:rPr>
+        <w:t xml:space="preserve"> of fatty acids with diabetes i</w:t>
+      </w:r>
+      <w:r>
+        <w:rPr>
+          <w:rFonts w:ascii="Arial" w:hAnsi="Arial" w:cs="Arial"/>
+        </w:rPr>
+        <w:t>s independent of directly measured insulin sensitivity and beta cell function</w:t>
+      </w:r>
+      <w:r>
+        <w:rPr>
+          <w:rFonts w:ascii="Arial" w:hAnsi="Arial" w:cs="Arial"/>
+        </w:rPr>
+        <w:t>.</w:t>
+      </w:r>
+      <w:r>
+        <w:rPr>
+          <w:rFonts w:ascii="Arial" w:hAnsi="Arial" w:cs="Arial"/>
+        </w:rPr>
+        <w:t xml:space="preserve">  We would like to talk to you about a power analysis and data analysis plan for this study as we prepare our grant application.   </w:t>
+      </w:r>
+    </w:p>
+    <w:p>
+      <w:pPr>
+        <w:pStyle w:val="ListParagraph"/>
+        <w:numPr>
+          <w:ilvl w:val="0"/>
+          <w:numId w:val="2"/>
+        </w:numPr>
+        <w:rPr>
+          <w:rFonts w:ascii="Arial" w:hAnsi="Arial" w:cs="Arial"/>
+          <w:color w:val="4F81BD" w:themeColor="accent1"/>
+        </w:rPr>
+      </w:pPr>
+      <w:r>
+        <w:rPr>
+          <w:rFonts w:ascii="Arial" w:hAnsi="Arial" w:cs="Arial"/>
+          <w:color w:val="4F81BD" w:themeColor="accent1"/>
+        </w:rPr>
+        <w:t>Is this study using an existing cohort, or are you recruiting new participants?</w:t>
+      </w:r>
+    </w:p>
+    <w:p>
+      <w:pPr>
+        <w:pStyle w:val="ListParagraph"/>
+        <w:numPr>
+          <w:ilvl w:val="0"/>
+          <w:numId w:val="2"/>
+        </w:numPr>
+        <w:rPr>
+          <w:rFonts w:ascii="Arial" w:hAnsi="Arial" w:cs="Arial"/>
+          <w:color w:val="4F81BD" w:themeColor="accent1"/>
+        </w:rPr>
+      </w:pPr>
+      <w:r>
+        <w:rPr>
+          <w:rFonts w:ascii="Arial" w:hAnsi="Arial" w:cs="Arial"/>
+          <w:color w:val="4F81BD" w:themeColor="accent1"/>
+        </w:rPr>
+        <w:t>What is the sample size of the cohort, and how many participants have developed type 2 diabetes during follow-up?</w:t>
+      </w:r>
+    </w:p>
+    <w:p>
+      <w:pPr>
+        <w:pStyle w:val="ListParagraph"/>
+        <w:numPr>
+          <w:ilvl w:val="0"/>
+          <w:numId w:val="2"/>
+        </w:numPr>
+        <w:rPr>
+          <w:rFonts w:ascii="Arial" w:hAnsi="Arial" w:cs="Arial"/>
+          <w:color w:val="4F81BD" w:themeColor="accent1"/>
+        </w:rPr>
+      </w:pPr>
+      <w:r>
+        <w:rPr>
+          <w:rFonts w:ascii="Arial" w:hAnsi="Arial" w:cs="Arial"/>
+          <w:color w:val="4F81BD" w:themeColor="accent1"/>
+        </w:rPr>
+        <w:t>How was insulin sensitivity/beta cell function measured</w:t>
+      </w:r>
+      <w:r>
+        <w:rPr>
+          <w:rFonts w:ascii="Arial" w:hAnsi="Arial" w:cs="Arial"/>
+          <w:color w:val="4F81BD" w:themeColor="accent1"/>
+        </w:rPr>
+        <w:t>?</w:t>
+      </w:r>
+    </w:p>
+    <w:p>
+      <w:pPr>
+        <w:pStyle w:val="ListParagraph"/>
+        <w:numPr>
+          <w:ilvl w:val="0"/>
+          <w:numId w:val="2"/>
+        </w:numPr>
+        <w:rPr>
+          <w:rFonts w:ascii="Arial" w:hAnsi="Arial" w:cs="Arial"/>
+          <w:color w:val="4F81BD" w:themeColor="accent1"/>
+        </w:rPr>
+      </w:pPr>
+      <w:r>
+        <w:rPr>
+          <w:rFonts w:ascii="Arial" w:hAnsi="Arial" w:cs="Arial"/>
+          <w:color w:val="4F81BD" w:themeColor="accent1"/>
+        </w:rPr>
+        <w:t>How will you handle the multiple comparisons problem given the large number of metabolites?</w:t>
+      </w:r>
+    </w:p>
+    <w:p>
+      <w:pPr>
+        <w:pStyle w:val="ListParagraph"/>
+        <w:numPr>
+          <w:ilvl w:val="0"/>
+          <w:numId w:val="2"/>
+        </w:numPr>
+        <w:rPr>
+          <w:rFonts w:ascii="Arial" w:hAnsi="Arial" w:cs="Arial"/>
+          <w:color w:val="4F81BD" w:themeColor="accent1"/>
+        </w:rPr>
+      </w:pPr>
+      <w:r>
+        <w:rPr>
+          <w:rFonts w:ascii="Arial" w:hAnsi="Arial" w:cs="Arial"/>
+          <w:color w:val="4F81BD" w:themeColor="accent1"/>
+        </w:rPr>
+        <w:t>Covariates?</w:t>
+      </w:r>
+    </w:p>
+    <w:p>
+      <w:pPr>
+        <w:pStyle w:val="ListParagraph"/>
+        <w:rPr>
+          <w:rFonts w:ascii="Arial" w:hAnsi="Arial" w:cs="Arial"/>
+        </w:rPr>
+      </w:pPr>
+    </w:p>
+    <w:p>
+      <w:pPr>
+        <w:pStyle w:val="ListParagraph"/>
+        <w:numPr>
+          <w:ilvl w:val="0"/>
+          <w:numId w:val="1"/>
+        </w:numPr>
+        <w:rPr>
+          <w:rFonts w:ascii="Arial" w:hAnsi="Arial" w:cs="Arial"/>
+          <w:b/>
+        </w:rPr>
+      </w:pPr>
+      <w:r>
+        <w:rPr>
+          <w:rFonts w:ascii="Arial" w:hAnsi="Arial" w:cs="Arial"/>
+          <w:b/>
+        </w:rPr>
+        <w:t>Genetic underpinnings of pulmonary fibrosis</w:t>
+      </w:r>
+    </w:p>
+    <w:p>
+      <w:pPr>
+        <w:pStyle w:val="ListParagraph"/>
+        <w:rPr>
+          <w:rFonts w:ascii="Arial" w:hAnsi="Arial" w:cs="Arial"/>
+        </w:rPr>
+      </w:pPr>
+      <w:r>
+        <w:rPr>
+          <w:rFonts w:ascii="Arial" w:hAnsi="Arial" w:cs="Arial"/>
+        </w:rPr>
+        <w:t xml:space="preserve">We have completed a genome-wide genetic association study for pulmonary fibrosis.  We identified 10 genetic variants that increase risk of pulmonary fibrosis in individuals of Northern European descent using a combination of familial cases (those with at least one first degree relative with disease) and sporadic cases (those with no known family history).  We want to extend this study to those of Korean and Mexican descent, since even though the prevalence is highest in those of European descent, the burden of disease is important in parts of Asia and among Latino populations.  We also want to understand whether these genetic variants are important in both familial and sporadic </w:t>
+      </w:r>
+      <w:r>
+        <w:rPr>
+          <w:rFonts w:ascii="Arial" w:hAnsi="Arial" w:cs="Arial"/>
+        </w:rPr>
         <w:lastRenderedPageBreak/>
-        <w:t>What is the unit of measurement</w:t>
+        <w:t xml:space="preserve">disease or whether certain variants are disproportionately associated with one or the other form of disease.  </w:t>
+      </w:r>
+      <w:r>
+        <w:rPr>
+          <w:rFonts w:ascii="Arial" w:hAnsi="Arial" w:cs="Arial"/>
+        </w:rPr>
+        <w:t xml:space="preserve">We would like to talk to you about a power analysis and data analysis plan for this study as we prepare our grant application.   </w:t>
+      </w:r>
+      <w:r>
+        <w:rPr>
+          <w:rFonts w:ascii="Arial" w:hAnsi="Arial" w:cs="Arial"/>
+        </w:rPr>
+        <w:t xml:space="preserve">  </w:t>
+      </w:r>
+      <w:r>
+        <w:rPr>
+          <w:rFonts w:ascii="Arial" w:hAnsi="Arial" w:cs="Arial"/>
+        </w:rPr>
+        <w:t xml:space="preserve"> </w:t>
+      </w:r>
+    </w:p>
+    <w:p>
+      <w:pPr>
+        <w:pStyle w:val="ListParagraph"/>
+        <w:numPr>
+          <w:ilvl w:val="0"/>
+          <w:numId w:val="2"/>
+        </w:numPr>
+        <w:shd w:val="clear" w:color="auto" w:fill="FFFFFF" w:themeFill="background1"/>
+        <w:rPr>
+          <w:rFonts w:ascii="Arial" w:hAnsi="Arial" w:cs="Arial"/>
+          <w:color w:val="4F81BD" w:themeColor="accent1"/>
+        </w:rPr>
+      </w:pPr>
+      <w:r>
+        <w:rPr>
+          <w:rFonts w:ascii="Arial" w:hAnsi="Arial" w:cs="Arial"/>
+          <w:color w:val="4F81BD" w:themeColor="accent1"/>
+        </w:rPr>
+        <w:t>How many cases and controls do you currently have, or plan to recruit, in the Korean and Mexican descent populations?</w:t>
+      </w:r>
+    </w:p>
+    <w:p>
+      <w:pPr>
+        <w:pStyle w:val="ListParagraph"/>
+        <w:numPr>
+          <w:ilvl w:val="0"/>
+          <w:numId w:val="2"/>
+        </w:numPr>
+        <w:shd w:val="clear" w:color="auto" w:fill="FFFFFF" w:themeFill="background1"/>
+        <w:rPr>
+          <w:rFonts w:ascii="Arial" w:hAnsi="Arial" w:cs="Arial"/>
+          <w:color w:val="4F81BD" w:themeColor="accent1"/>
+        </w:rPr>
+      </w:pPr>
+      <w:r>
+        <w:rPr>
+          <w:rFonts w:ascii="Arial" w:hAnsi="Arial" w:cs="Arial"/>
+          <w:color w:val="4F81BD" w:themeColor="accent1"/>
+        </w:rPr>
+        <w:t>Do you have access to existing biobanks or registries, or will you be recruiting new participants?</w:t>
+      </w:r>
+    </w:p>
+    <w:p>
+      <w:pPr>
+        <w:pStyle w:val="ListParagraph"/>
+        <w:numPr>
+          <w:ilvl w:val="0"/>
+          <w:numId w:val="2"/>
+        </w:numPr>
+        <w:shd w:val="clear" w:color="auto" w:fill="FFFFFF" w:themeFill="background1"/>
+        <w:rPr>
+          <w:rFonts w:ascii="Arial" w:hAnsi="Arial" w:cs="Arial"/>
+          <w:color w:val="4F81BD" w:themeColor="accent1"/>
+        </w:rPr>
+      </w:pPr>
+      <w:r>
+        <w:rPr>
+          <w:rFonts w:ascii="Arial" w:hAnsi="Arial" w:cs="Arial"/>
+          <w:color w:val="4F81BD" w:themeColor="accent1"/>
+        </w:rPr>
+        <w:t>Are you planning to use the same genotyping platform as the original study, or will you use imputation?</w:t>
+      </w:r>
+    </w:p>
+    <w:p>
+      <w:pPr>
+        <w:pStyle w:val="ListParagraph"/>
+        <w:numPr>
+          <w:ilvl w:val="0"/>
+          <w:numId w:val="2"/>
+        </w:numPr>
+        <w:shd w:val="clear" w:color="auto" w:fill="FFFFFF" w:themeFill="background1"/>
+        <w:rPr>
+          <w:rFonts w:ascii="Arial" w:hAnsi="Arial" w:cs="Arial"/>
+          <w:color w:val="4F81BD" w:themeColor="accent1"/>
+        </w:rPr>
+      </w:pPr>
+      <w:r>
+        <w:rPr>
+          <w:rFonts w:ascii="Arial" w:hAnsi="Arial" w:cs="Arial"/>
+          <w:color w:val="4F81BD" w:themeColor="accent1"/>
+        </w:rPr>
+        <w:t>What is the minor allele frequency of the 10 variants in these new populations</w:t>
       </w:r>
       <w:r>
         <w:rPr>
@@ -537,67 +1091,28 @@
           <w:rFonts w:ascii="Arial" w:hAnsi="Arial" w:cs="Arial"/>
           <w:color w:val="4F81BD" w:themeColor="accent1"/>
         </w:rPr>
-        <w:t xml:space="preserve"> individual cells, cell culture wells, or experiments?</w:t>
-      </w:r>
-    </w:p>
-    <w:p>
-      <w:pPr>
-        <w:pStyle w:val="ListParagraph"/>
-        <w:numPr>
-          <w:ilvl w:val="0"/>
-          <w:numId w:val="2"/>
-        </w:numPr>
-        <w:rPr>
-          <w:rFonts w:ascii="Arial" w:hAnsi="Arial" w:cs="Arial"/>
-          <w:color w:val="4F81BD" w:themeColor="accent1"/>
-        </w:rPr>
-      </w:pPr>
-      <w:r>
-        <w:rPr>
-          <w:rFonts w:ascii="Arial" w:hAnsi="Arial" w:cs="Arial"/>
-          <w:color w:val="4F81BD" w:themeColor="accent1"/>
-        </w:rPr>
-        <w:t>How many times will you repeat each experiment?</w:t>
-      </w:r>
-    </w:p>
-    <w:p>
-      <w:pPr>
-        <w:pStyle w:val="ListParagraph"/>
-        <w:numPr>
-          <w:ilvl w:val="0"/>
-          <w:numId w:val="2"/>
-        </w:numPr>
-        <w:rPr>
-          <w:rFonts w:ascii="Arial" w:hAnsi="Arial" w:cs="Arial"/>
-          <w:color w:val="4F81BD" w:themeColor="accent1"/>
-        </w:rPr>
-      </w:pPr>
-      <w:r>
-        <w:rPr>
-          <w:rFonts w:ascii="Arial" w:hAnsi="Arial" w:cs="Arial"/>
-          <w:color w:val="4F81BD" w:themeColor="accent1"/>
-        </w:rPr>
-        <w:t>Will you be looking at dose-response relationships, or a single dose of each compound?</w:t>
-      </w:r>
-    </w:p>
-    <w:p>
-      <w:pPr>
-        <w:pStyle w:val="ListParagraph"/>
-        <w:numPr>
-          <w:ilvl w:val="0"/>
-          <w:numId w:val="2"/>
-        </w:numPr>
-        <w:rPr>
-          <w:rFonts w:ascii="Arial" w:hAnsi="Arial" w:cs="Arial"/>
-          <w:color w:val="4F81BD" w:themeColor="accent1"/>
-        </w:rPr>
-      </w:pPr>
-      <w:r>
-        <w:rPr>
-          <w:rFonts w:ascii="Arial" w:hAnsi="Arial" w:cs="Arial"/>
-          <w:color w:val="4F81BD" w:themeColor="accent1"/>
-        </w:rPr>
-        <w:t>Are you interested in secondary outcomes like cell viability or expression of other mucins, and if so, how should those factor into the sample size?</w:t>
+        <w:t xml:space="preserve"> do you have data on this?</w:t>
+      </w:r>
+    </w:p>
+    <w:p>
+      <w:pPr>
+        <w:pStyle w:val="ListParagraph"/>
+        <w:numPr>
+          <w:ilvl w:val="0"/>
+          <w:numId w:val="2"/>
+        </w:numPr>
+        <w:shd w:val="clear" w:color="auto" w:fill="FFFFFF" w:themeFill="background1"/>
+        <w:rPr>
+          <w:rFonts w:ascii="Arial" w:hAnsi="Arial" w:cs="Arial"/>
+          <w:color w:val="4F81BD" w:themeColor="accent1"/>
+        </w:rPr>
+      </w:pPr>
+      <w:r>
+        <w:rPr>
+          <w:rFonts w:ascii="Arial" w:hAnsi="Arial" w:cs="Arial"/>
+          <w:color w:val="4F81BD" w:themeColor="accent1"/>
+        </w:rPr>
+        <w:t>Is the primary goal to replicate the 10 known variants, or to also discover new variants?</w:t>
       </w:r>
     </w:p>
     <w:p>
@@ -625,216 +1140,225 @@
           <w:rFonts w:ascii="Arial" w:hAnsi="Arial" w:cs="Arial"/>
           <w:b/>
         </w:rPr>
-        <w:t>Metabolite predictors of incident type 2 diabetes in Hispanic Americans</w:t>
-      </w:r>
-    </w:p>
-    <w:p>
-      <w:pPr>
-        <w:pStyle w:val="ListParagraph"/>
-        <w:rPr>
-          <w:rFonts w:ascii="Arial" w:hAnsi="Arial" w:cs="Arial"/>
-        </w:rPr>
-      </w:pPr>
-      <w:r>
-        <w:rPr>
-          <w:rFonts w:ascii="Arial" w:hAnsi="Arial" w:cs="Arial"/>
-        </w:rPr>
-        <w:t xml:space="preserve">Insulin resistance and impaired fatty acid metabolism are risk factors for type 2 diabetes.  While several investigators have developed predictive equations for type 2 diabetes risk using insulin resistance measures, much of the variation in risk remains unexplained.  Some small, cross-sectional studies </w:t>
-      </w:r>
-      <w:r>
-        <w:rPr>
-          <w:rFonts w:ascii="Arial" w:hAnsi="Arial" w:cs="Arial"/>
-        </w:rPr>
-        <w:t xml:space="preserve">in European Americans </w:t>
-      </w:r>
-      <w:r>
-        <w:rPr>
-          <w:rFonts w:ascii="Arial" w:hAnsi="Arial" w:cs="Arial"/>
-        </w:rPr>
-        <w:t>have found an association between fatty acid metabolites and type 2 diabe</w:t>
-      </w:r>
-      <w:r>
-        <w:rPr>
-          <w:rFonts w:ascii="Arial" w:hAnsi="Arial" w:cs="Arial"/>
-        </w:rPr>
-        <w:t>tes, but the</w:t>
-      </w:r>
-      <w:r>
-        <w:rPr>
-          <w:rFonts w:ascii="Arial" w:hAnsi="Arial" w:cs="Arial"/>
-        </w:rPr>
-        <w:t xml:space="preserve"> </w:t>
-      </w:r>
-      <w:r>
-        <w:rPr>
-          <w:rFonts w:ascii="Arial" w:hAnsi="Arial" w:cs="Arial"/>
-        </w:rPr>
-        <w:t xml:space="preserve">extent to which fatty acid metabolites predict type 2 diabetes risk in minority populations remains unknown. </w:t>
-      </w:r>
-      <w:r>
-        <w:rPr>
-          <w:rFonts w:ascii="Arial" w:hAnsi="Arial" w:cs="Arial"/>
-        </w:rPr>
-        <w:t xml:space="preserve">To establish an independence of fatty acids from insulin resistance in predicting risk of incident diabetes, we </w:t>
-      </w:r>
-      <w:r>
-        <w:rPr>
-          <w:rFonts w:ascii="Arial" w:hAnsi="Arial" w:cs="Arial"/>
-        </w:rPr>
-        <w:t>propose to evaluate the</w:t>
-      </w:r>
-      <w:r>
-        <w:rPr>
-          <w:rFonts w:ascii="Arial" w:hAnsi="Arial" w:cs="Arial"/>
-        </w:rPr>
-        <w:t xml:space="preserve"> metabolome of a multiethnic cohort free of diabetes at baseline. We </w:t>
-      </w:r>
-      <w:r>
-        <w:rPr>
-          <w:rFonts w:ascii="Arial" w:hAnsi="Arial" w:cs="Arial"/>
-        </w:rPr>
-        <w:t>will also attempt</w:t>
-      </w:r>
-      <w:r>
-        <w:rPr>
-          <w:rFonts w:ascii="Arial" w:hAnsi="Arial" w:cs="Arial"/>
-        </w:rPr>
-        <w:t xml:space="preserve"> to evaluate if </w:t>
-      </w:r>
-      <w:r>
-        <w:rPr>
-          <w:rFonts w:ascii="Arial" w:hAnsi="Arial" w:cs="Arial"/>
-        </w:rPr>
-        <w:t>groups of metabolites</w:t>
-      </w:r>
-      <w:r>
-        <w:rPr>
-          <w:rFonts w:ascii="Arial" w:hAnsi="Arial" w:cs="Arial"/>
-        </w:rPr>
-        <w:t xml:space="preserve"> </w:t>
-      </w:r>
-      <w:r>
-        <w:rPr>
-          <w:rFonts w:ascii="Arial" w:hAnsi="Arial" w:cs="Arial"/>
-        </w:rPr>
-        <w:t>differ</w:t>
-      </w:r>
-      <w:r>
-        <w:rPr>
-          <w:rFonts w:ascii="Arial" w:hAnsi="Arial" w:cs="Arial"/>
-        </w:rPr>
-        <w:t xml:space="preserve"> among different race/ethnicities and genders and whether the association</w:t>
-      </w:r>
-      <w:r>
-        <w:rPr>
-          <w:rFonts w:ascii="Arial" w:hAnsi="Arial" w:cs="Arial"/>
-        </w:rPr>
-        <w:t xml:space="preserve"> of fatty acids with diabetes i</w:t>
-      </w:r>
-      <w:r>
-        <w:rPr>
-          <w:rFonts w:ascii="Arial" w:hAnsi="Arial" w:cs="Arial"/>
-        </w:rPr>
-        <w:t>s independent of directly measured insulin sensitivity and beta cell function</w:t>
-      </w:r>
-      <w:r>
-        <w:rPr>
-          <w:rFonts w:ascii="Arial" w:hAnsi="Arial" w:cs="Arial"/>
-        </w:rPr>
-        <w:t>.</w:t>
-      </w:r>
-      <w:r>
-        <w:rPr>
-          <w:rFonts w:ascii="Arial" w:hAnsi="Arial" w:cs="Arial"/>
-        </w:rPr>
-        <w:t xml:space="preserve">  We would like to talk to you about a power analysis and data analysis plan for this study as we prepare our grant application.   </w:t>
-      </w:r>
-    </w:p>
-    <w:p>
-      <w:pPr>
-        <w:pStyle w:val="ListParagraph"/>
-        <w:numPr>
-          <w:ilvl w:val="0"/>
-          <w:numId w:val="2"/>
-        </w:numPr>
-        <w:rPr>
-          <w:rFonts w:ascii="Arial" w:hAnsi="Arial" w:cs="Arial"/>
-          <w:color w:val="4F81BD" w:themeColor="accent1"/>
-        </w:rPr>
-      </w:pPr>
-      <w:r>
-        <w:rPr>
-          <w:rFonts w:ascii="Arial" w:hAnsi="Arial" w:cs="Arial"/>
-          <w:color w:val="4F81BD" w:themeColor="accent1"/>
-        </w:rPr>
-        <w:t>Is this study using an existing cohort, or are you recruiting new participants?</w:t>
-      </w:r>
-    </w:p>
-    <w:p>
-      <w:pPr>
-        <w:pStyle w:val="ListParagraph"/>
-        <w:numPr>
-          <w:ilvl w:val="0"/>
-          <w:numId w:val="2"/>
-        </w:numPr>
-        <w:rPr>
-          <w:rFonts w:ascii="Arial" w:hAnsi="Arial" w:cs="Arial"/>
-          <w:color w:val="4F81BD" w:themeColor="accent1"/>
-        </w:rPr>
-      </w:pPr>
-      <w:r>
-        <w:rPr>
-          <w:rFonts w:ascii="Arial" w:hAnsi="Arial" w:cs="Arial"/>
-          <w:color w:val="4F81BD" w:themeColor="accent1"/>
-        </w:rPr>
-        <w:t>What is the sample size of the cohort, and how many participants have developed type 2 diabetes during follow-up?</w:t>
-      </w:r>
-    </w:p>
-    <w:p>
-      <w:pPr>
-        <w:pStyle w:val="ListParagraph"/>
-        <w:numPr>
-          <w:ilvl w:val="0"/>
-          <w:numId w:val="2"/>
-        </w:numPr>
-        <w:rPr>
-          <w:rFonts w:ascii="Arial" w:hAnsi="Arial" w:cs="Arial"/>
-          <w:color w:val="4F81BD" w:themeColor="accent1"/>
-        </w:rPr>
-      </w:pPr>
-      <w:r>
-        <w:rPr>
-          <w:rFonts w:ascii="Arial" w:hAnsi="Arial" w:cs="Arial"/>
-          <w:color w:val="4F81BD" w:themeColor="accent1"/>
-        </w:rPr>
-        <w:t>How was insulin sensitivity/beta cell function measured</w:t>
-      </w:r>
-      <w:r>
-        <w:rPr>
-          <w:rFonts w:ascii="Arial" w:hAnsi="Arial" w:cs="Arial"/>
-          <w:color w:val="4F81BD" w:themeColor="accent1"/>
-        </w:rPr>
-        <w:t>?</w:t>
-      </w:r>
-    </w:p>
-    <w:p>
-      <w:pPr>
-        <w:pStyle w:val="ListParagraph"/>
-        <w:numPr>
-          <w:ilvl w:val="0"/>
-          <w:numId w:val="2"/>
-        </w:numPr>
-        <w:rPr>
-          <w:rFonts w:ascii="Arial" w:hAnsi="Arial" w:cs="Arial"/>
-          <w:color w:val="4F81BD" w:themeColor="accent1"/>
-        </w:rPr>
-      </w:pPr>
-      <w:r>
-        <w:rPr>
-          <w:rFonts w:ascii="Arial" w:hAnsi="Arial" w:cs="Arial"/>
-          <w:color w:val="4F81BD" w:themeColor="accent1"/>
-        </w:rPr>
-        <w:t>How will you handle the multiple comparisons problem given the large number of metabolites?</w:t>
+        <w:t>P</w:t>
+      </w:r>
+      <w:r>
+        <w:rPr>
+          <w:rFonts w:ascii="Arial" w:hAnsi="Arial" w:cs="Arial"/>
+          <w:b/>
+        </w:rPr>
+        <w:t>atient outcomes in glaucoma therapy: drops vs. blebs</w:t>
+      </w:r>
+    </w:p>
+    <w:p>
+      <w:pPr>
+        <w:pStyle w:val="ListParagraph"/>
+        <w:rPr>
+          <w:rFonts w:ascii="Arial" w:hAnsi="Arial" w:cs="Arial"/>
+        </w:rPr>
+      </w:pPr>
+      <w:r>
+        <w:rPr>
+          <w:rFonts w:ascii="Arial" w:hAnsi="Arial" w:cs="Arial"/>
+        </w:rPr>
+        <w:t xml:space="preserve">Glaucoma is characterized by increased intraocular pressure that progressively destroys the optic nerve, leading to vision loss.  Treatments for glaucoma are centered on lowering intraocular pressure enough to stop nerve damage while maintaining high enough pressure to prevent macular folding and other adverse side effects.   The least invasive </w:t>
+      </w:r>
+      <w:r>
+        <w:rPr>
+          <w:rFonts w:ascii="Arial" w:hAnsi="Arial" w:cs="Arial"/>
+        </w:rPr>
+        <w:t xml:space="preserve">therapeutic approach is the prescription of eye drops, the most invasive is trabeculectomy, or surgical creation of an alternative drainage system (blebs), to allow fluid to leave the eye.  Trabeculectomy has a much higher success rate than eye drops, but because of the cost and invasiveness of surgery, most insurance plans require treatment with drops before moving to trabeculectomy.  </w:t>
+      </w:r>
+      <w:r>
+        <w:rPr>
+          <w:rFonts w:ascii="Arial" w:hAnsi="Arial" w:cs="Arial"/>
+        </w:rPr>
+        <w:t>Given the potentially rapid decline in optic nerve function with prolonged elevated intraocular pressures, we want to avoid using treatments that are likely to fail on the highest risk patients</w:t>
+      </w:r>
+      <w:r>
+        <w:rPr>
+          <w:rFonts w:ascii="Arial" w:hAnsi="Arial" w:cs="Arial"/>
+        </w:rPr>
+        <w:t xml:space="preserve"> and need evidence-based decision rules for the insurance companies</w:t>
+      </w:r>
+      <w:r>
+        <w:rPr>
+          <w:rFonts w:ascii="Arial" w:hAnsi="Arial" w:cs="Arial"/>
+        </w:rPr>
+        <w:t xml:space="preserve">.  </w:t>
+      </w:r>
+      <w:r>
+        <w:rPr>
+          <w:rFonts w:ascii="Arial" w:hAnsi="Arial" w:cs="Arial"/>
+        </w:rPr>
+        <w:t xml:space="preserve">We are planning a study to examine the </w:t>
+      </w:r>
+      <w:r>
+        <w:rPr>
+          <w:rFonts w:ascii="Arial" w:hAnsi="Arial" w:cs="Arial"/>
+        </w:rPr>
+        <w:t>clinical and demographic characteristics of the minority of patients who respond to eye drop therapy in order to better target that therapy to those most likely to have a positive treatment response.</w:t>
+      </w:r>
+      <w:r>
+        <w:rPr>
+          <w:rFonts w:ascii="Arial" w:hAnsi="Arial" w:cs="Arial"/>
+        </w:rPr>
+        <w:t xml:space="preserve">  We would like to talk to you about a study design and data analysis plan for this study as we prepare our grant application.  </w:t>
+      </w:r>
+    </w:p>
+    <w:p>
+      <w:pPr>
+        <w:pStyle w:val="ListParagraph"/>
+        <w:numPr>
+          <w:ilvl w:val="0"/>
+          <w:numId w:val="2"/>
+        </w:numPr>
+        <w:rPr>
+          <w:rFonts w:ascii="Arial" w:hAnsi="Arial" w:cs="Arial"/>
+          <w:color w:val="4F81BD" w:themeColor="accent1"/>
+        </w:rPr>
+      </w:pPr>
+      <w:r>
+        <w:rPr>
+          <w:rFonts w:ascii="Arial" w:hAnsi="Arial" w:cs="Arial"/>
+          <w:color w:val="4F81BD" w:themeColor="accent1"/>
+        </w:rPr>
+        <w:t>I</w:t>
+      </w:r>
+      <w:r>
+        <w:rPr>
+          <w:rFonts w:ascii="Arial" w:hAnsi="Arial" w:cs="Arial"/>
+          <w:color w:val="4F81BD" w:themeColor="accent1"/>
+        </w:rPr>
+        <w:t>s this a retrospective study using existing clinical records, or a prospective study?</w:t>
+      </w:r>
+    </w:p>
+    <w:p>
+      <w:pPr>
+        <w:pStyle w:val="ListParagraph"/>
+        <w:numPr>
+          <w:ilvl w:val="1"/>
+          <w:numId w:val="2"/>
+        </w:numPr>
+        <w:rPr>
+          <w:rFonts w:ascii="Arial" w:hAnsi="Arial" w:cs="Arial"/>
+          <w:color w:val="4F81BD" w:themeColor="accent1"/>
+        </w:rPr>
+      </w:pPr>
+      <w:r>
+        <w:rPr>
+          <w:rFonts w:ascii="Arial" w:hAnsi="Arial" w:cs="Arial"/>
+          <w:color w:val="4F81BD" w:themeColor="accent1"/>
+        </w:rPr>
+        <w:t>Patient population: single clinic, health system, other?</w:t>
+      </w:r>
+    </w:p>
+    <w:p>
+      <w:pPr>
+        <w:pStyle w:val="ListParagraph"/>
+        <w:numPr>
+          <w:ilvl w:val="0"/>
+          <w:numId w:val="2"/>
+        </w:numPr>
+        <w:rPr>
+          <w:rFonts w:ascii="Arial" w:hAnsi="Arial" w:cs="Arial"/>
+          <w:color w:val="4F81BD" w:themeColor="accent1"/>
+        </w:rPr>
+      </w:pPr>
+      <w:r>
+        <w:rPr>
+          <w:rFonts w:ascii="Arial" w:hAnsi="Arial" w:cs="Arial"/>
+          <w:color w:val="4F81BD" w:themeColor="accent1"/>
+        </w:rPr>
+        <w:t xml:space="preserve">Primary outcome: </w:t>
+      </w:r>
+      <w:r>
+        <w:rPr>
+          <w:rFonts w:ascii="Arial" w:hAnsi="Arial" w:cs="Arial"/>
+          <w:color w:val="4F81BD" w:themeColor="accent1"/>
+        </w:rPr>
+        <w:t>treatment response</w:t>
+      </w:r>
+      <w:r>
+        <w:rPr>
+          <w:rFonts w:ascii="Arial" w:hAnsi="Arial" w:cs="Arial"/>
+          <w:color w:val="4F81BD" w:themeColor="accent1"/>
+        </w:rPr>
+        <w:t xml:space="preserve">, decrease in eye pressure, </w:t>
+      </w:r>
+      <w:r>
+        <w:rPr>
+          <w:rFonts w:ascii="Arial" w:hAnsi="Arial" w:cs="Arial"/>
+          <w:color w:val="4F81BD" w:themeColor="accent1"/>
+        </w:rPr>
+        <w:t xml:space="preserve">or </w:t>
+      </w:r>
+      <w:r>
+        <w:rPr>
+          <w:rFonts w:ascii="Arial" w:hAnsi="Arial" w:cs="Arial"/>
+          <w:color w:val="4F81BD" w:themeColor="accent1"/>
+        </w:rPr>
+        <w:t>not needing blebs?</w:t>
+      </w:r>
+    </w:p>
+    <w:p>
+      <w:pPr>
+        <w:pStyle w:val="ListParagraph"/>
+        <w:numPr>
+          <w:ilvl w:val="0"/>
+          <w:numId w:val="2"/>
+        </w:numPr>
+        <w:rPr>
+          <w:rFonts w:ascii="Arial" w:hAnsi="Arial" w:cs="Arial"/>
+          <w:color w:val="4F81BD" w:themeColor="accent1"/>
+        </w:rPr>
+      </w:pPr>
+      <w:r>
+        <w:rPr>
+          <w:rFonts w:ascii="Arial" w:hAnsi="Arial" w:cs="Arial"/>
+          <w:color w:val="4F81BD" w:themeColor="accent1"/>
+        </w:rPr>
+        <w:t>Clinically meaningful difference in eye pressure?</w:t>
+      </w:r>
+    </w:p>
+    <w:p>
+      <w:pPr>
+        <w:pStyle w:val="ListParagraph"/>
+        <w:numPr>
+          <w:ilvl w:val="1"/>
+          <w:numId w:val="2"/>
+        </w:numPr>
+        <w:rPr>
+          <w:rFonts w:ascii="Arial" w:hAnsi="Arial" w:cs="Arial"/>
+          <w:color w:val="4F81BD" w:themeColor="accent1"/>
+        </w:rPr>
+      </w:pPr>
+      <w:r>
+        <w:rPr>
+          <w:rFonts w:ascii="Arial" w:hAnsi="Arial" w:cs="Arial"/>
+          <w:color w:val="4F81BD" w:themeColor="accent1"/>
+        </w:rPr>
+        <w:t>Time frame of when you would see results?</w:t>
+      </w:r>
+    </w:p>
+    <w:p>
+      <w:pPr>
+        <w:pStyle w:val="ListParagraph"/>
+        <w:numPr>
+          <w:ilvl w:val="0"/>
+          <w:numId w:val="2"/>
+        </w:numPr>
+        <w:rPr>
+          <w:rFonts w:ascii="Arial" w:hAnsi="Arial" w:cs="Arial"/>
+          <w:color w:val="4F81BD" w:themeColor="accent1"/>
+        </w:rPr>
+      </w:pPr>
+      <w:r>
+        <w:rPr>
+          <w:rFonts w:ascii="Arial" w:hAnsi="Arial" w:cs="Arial"/>
+          <w:color w:val="4F81BD" w:themeColor="accent1"/>
+        </w:rPr>
+        <w:t>How will you handle patients who were switched from drops to surgery during follow-up?</w:t>
       </w:r>
     </w:p>
     <w:p>
@@ -856,6 +1380,122 @@
         </w:rPr>
         <w:t>Covariates?</w:t>
       </w:r>
+      <w:r>
+        <w:rPr>
+          <w:rFonts w:ascii="Arial" w:hAnsi="Arial" w:cs="Arial"/>
+          <w:color w:val="4F81BD" w:themeColor="accent1"/>
+        </w:rPr>
+        <w:t xml:space="preserve"> Things?</w:t>
+      </w:r>
+    </w:p>
+    <w:p>
+      <w:pPr>
+        <w:pStyle w:val="ListParagraph"/>
+        <w:numPr>
+          <w:ilvl w:val="1"/>
+          <w:numId w:val="2"/>
+        </w:numPr>
+        <w:rPr>
+          <w:rFonts w:ascii="Arial" w:hAnsi="Arial" w:cs="Arial"/>
+          <w:color w:val="4F81BD" w:themeColor="accent1"/>
+        </w:rPr>
+      </w:pPr>
+      <w:r>
+        <w:rPr>
+          <w:rFonts w:ascii="Arial" w:hAnsi="Arial" w:cs="Arial"/>
+          <w:color w:val="4F81BD" w:themeColor="accent1"/>
+        </w:rPr>
+        <w:t>C</w:t>
+      </w:r>
+      <w:r>
+        <w:rPr>
+          <w:rFonts w:ascii="Arial" w:hAnsi="Arial" w:cs="Arial"/>
+          <w:color w:val="4F81BD" w:themeColor="accent1"/>
+        </w:rPr>
+        <w:t xml:space="preserve">linical and demographic </w:t>
+      </w:r>
+      <w:r>
+        <w:rPr>
+          <w:rFonts w:ascii="Arial" w:hAnsi="Arial" w:cs="Arial"/>
+          <w:color w:val="4F81BD" w:themeColor="accent1"/>
+        </w:rPr>
+        <w:t>characteristics that you think will impact</w:t>
+      </w:r>
+      <w:r>
+        <w:rPr>
+          <w:rFonts w:ascii="Arial" w:hAnsi="Arial" w:cs="Arial"/>
+          <w:color w:val="4F81BD" w:themeColor="accent1"/>
+        </w:rPr>
+        <w:t xml:space="preserve"> the study?</w:t>
+      </w:r>
+    </w:p>
+    <w:p>
+      <w:pPr>
+        <w:pStyle w:val="ListParagraph"/>
+        <w:numPr>
+          <w:ilvl w:val="1"/>
+          <w:numId w:val="2"/>
+        </w:numPr>
+        <w:rPr>
+          <w:rFonts w:ascii="Arial" w:hAnsi="Arial" w:cs="Arial"/>
+          <w:color w:val="4F81BD" w:themeColor="accent1"/>
+        </w:rPr>
+      </w:pPr>
+      <w:r>
+        <w:rPr>
+          <w:rFonts w:ascii="Arial" w:hAnsi="Arial" w:cs="Arial"/>
+          <w:color w:val="4F81BD" w:themeColor="accent1"/>
+        </w:rPr>
+        <w:t>Are you measuring eye drop adherence?</w:t>
+      </w:r>
+    </w:p>
+    <w:p>
+      <w:pPr>
+        <w:pStyle w:val="ListParagraph"/>
+        <w:numPr>
+          <w:ilvl w:val="0"/>
+          <w:numId w:val="2"/>
+        </w:numPr>
+        <w:rPr>
+          <w:rFonts w:ascii="Arial" w:hAnsi="Arial" w:cs="Arial"/>
+          <w:color w:val="4F81BD" w:themeColor="accent1"/>
+        </w:rPr>
+      </w:pPr>
+      <w:r>
+        <w:rPr>
+          <w:rFonts w:ascii="Arial" w:hAnsi="Arial" w:cs="Arial"/>
+          <w:color w:val="4F81BD" w:themeColor="accent1"/>
+        </w:rPr>
+        <w:t xml:space="preserve">Does glaucoma impact one eye or both eyes? </w:t>
+      </w:r>
+      <w:r>
+        <w:rPr>
+          <w:rFonts w:ascii="Arial" w:hAnsi="Arial" w:cs="Arial"/>
+          <w:color w:val="4F81BD" w:themeColor="accent1"/>
+        </w:rPr>
+        <w:t xml:space="preserve">Repeated measures for patients with both eyes </w:t>
+      </w:r>
+    </w:p>
+    <w:p>
+      <w:pPr>
+        <w:pStyle w:val="ListParagraph"/>
+        <w:numPr>
+          <w:ilvl w:val="1"/>
+          <w:numId w:val="2"/>
+        </w:numPr>
+        <w:rPr>
+          <w:rFonts w:ascii="Arial" w:hAnsi="Arial" w:cs="Arial"/>
+          <w:color w:val="4F81BD" w:themeColor="accent1"/>
+        </w:rPr>
+      </w:pPr>
+      <w:r>
+        <w:rPr>
+          <w:rFonts w:ascii="Arial" w:hAnsi="Arial" w:cs="Arial"/>
+          <w:color w:val="4F81BD" w:themeColor="accent1"/>
+        </w:rPr>
+        <w:lastRenderedPageBreak/>
+        <w:t>Drops go in both eyes but surgery in one eye at a time</w:t>
+      </w:r>
     </w:p>
     <w:p>
       <w:pPr>
@@ -882,391 +1522,6 @@
           <w:rFonts w:ascii="Arial" w:hAnsi="Arial" w:cs="Arial"/>
           <w:b/>
         </w:rPr>
-        <w:t>Genetic underpinnings of pulmonary fibrosis</w:t>
-      </w:r>
-    </w:p>
-    <w:p>
-      <w:pPr>
-        <w:pStyle w:val="ListParagraph"/>
-        <w:rPr>
-          <w:rFonts w:ascii="Arial" w:hAnsi="Arial" w:cs="Arial"/>
-        </w:rPr>
-      </w:pPr>
-      <w:r>
-        <w:rPr>
-          <w:rFonts w:ascii="Arial" w:hAnsi="Arial" w:cs="Arial"/>
-        </w:rPr>
-        <w:t xml:space="preserve">We have completed a genome-wide genetic association study for pulmonary fibrosis.  We identified 10 genetic variants that increase risk of pulmonary fibrosis in individuals of Northern European descent using a combination of familial cases (those with at least one first degree relative with disease) and sporadic cases (those with no known family history).  We want to extend this study to those of Korean and Mexican descent, since even though the prevalence is highest in those of European descent, the burden of disease is important in parts of Asia and among Latino populations.  We also want to understand whether these genetic variants are important in both familial and sporadic disease or whether certain variants are disproportionately associated with one or the other form of disease.  </w:t>
-      </w:r>
-      <w:r>
-        <w:rPr>
-          <w:rFonts w:ascii="Arial" w:hAnsi="Arial" w:cs="Arial"/>
-        </w:rPr>
-        <w:t xml:space="preserve">We would like to talk to you about a power analysis and data analysis plan for this study as we prepare our grant application.   </w:t>
-      </w:r>
-      <w:r>
-        <w:rPr>
-          <w:rFonts w:ascii="Arial" w:hAnsi="Arial" w:cs="Arial"/>
-        </w:rPr>
-        <w:t xml:space="preserve">  </w:t>
-      </w:r>
-      <w:r>
-        <w:rPr>
-          <w:rFonts w:ascii="Arial" w:hAnsi="Arial" w:cs="Arial"/>
-        </w:rPr>
-        <w:t xml:space="preserve"> </w:t>
-      </w:r>
-    </w:p>
-    <w:p>
-      <w:pPr>
-        <w:pStyle w:val="ListParagraph"/>
-        <w:numPr>
-          <w:ilvl w:val="0"/>
-          <w:numId w:val="2"/>
-        </w:numPr>
-        <w:shd w:val="clear" w:color="auto" w:fill="FFFFFF" w:themeFill="background1"/>
-        <w:rPr>
-          <w:rFonts w:ascii="Arial" w:hAnsi="Arial" w:cs="Arial"/>
-          <w:color w:val="4F81BD" w:themeColor="accent1"/>
-        </w:rPr>
-      </w:pPr>
-      <w:r>
-        <w:rPr>
-          <w:rFonts w:ascii="Arial" w:hAnsi="Arial" w:cs="Arial"/>
-          <w:color w:val="4F81BD" w:themeColor="accent1"/>
-        </w:rPr>
-        <w:t>How many cases and controls do you currently have, or plan to recruit, in the Korean and Mexican descent populations?</w:t>
-      </w:r>
-    </w:p>
-    <w:p>
-      <w:pPr>
-        <w:pStyle w:val="ListParagraph"/>
-        <w:numPr>
-          <w:ilvl w:val="0"/>
-          <w:numId w:val="2"/>
-        </w:numPr>
-        <w:shd w:val="clear" w:color="auto" w:fill="FFFFFF" w:themeFill="background1"/>
-        <w:rPr>
-          <w:rFonts w:ascii="Arial" w:hAnsi="Arial" w:cs="Arial"/>
-          <w:color w:val="4F81BD" w:themeColor="accent1"/>
-        </w:rPr>
-      </w:pPr>
-      <w:r>
-        <w:rPr>
-          <w:rFonts w:ascii="Arial" w:hAnsi="Arial" w:cs="Arial"/>
-          <w:color w:val="4F81BD" w:themeColor="accent1"/>
-        </w:rPr>
-        <w:lastRenderedPageBreak/>
-        <w:t>Do you have access to existing biobanks or registries, or will you be recruiting new participants?</w:t>
-      </w:r>
-    </w:p>
-    <w:p>
-      <w:pPr>
-        <w:pStyle w:val="ListParagraph"/>
-        <w:numPr>
-          <w:ilvl w:val="0"/>
-          <w:numId w:val="2"/>
-        </w:numPr>
-        <w:shd w:val="clear" w:color="auto" w:fill="FFFFFF" w:themeFill="background1"/>
-        <w:rPr>
-          <w:rFonts w:ascii="Arial" w:hAnsi="Arial" w:cs="Arial"/>
-          <w:color w:val="4F81BD" w:themeColor="accent1"/>
-        </w:rPr>
-      </w:pPr>
-      <w:r>
-        <w:rPr>
-          <w:rFonts w:ascii="Arial" w:hAnsi="Arial" w:cs="Arial"/>
-          <w:color w:val="4F81BD" w:themeColor="accent1"/>
-        </w:rPr>
-        <w:t>Are you planning to use the same genotyping platform as the original study, or will you use imputation?</w:t>
-      </w:r>
-    </w:p>
-    <w:p>
-      <w:pPr>
-        <w:pStyle w:val="ListParagraph"/>
-        <w:numPr>
-          <w:ilvl w:val="0"/>
-          <w:numId w:val="2"/>
-        </w:numPr>
-        <w:shd w:val="clear" w:color="auto" w:fill="FFFFFF" w:themeFill="background1"/>
-        <w:rPr>
-          <w:rFonts w:ascii="Arial" w:hAnsi="Arial" w:cs="Arial"/>
-          <w:color w:val="4F81BD" w:themeColor="accent1"/>
-        </w:rPr>
-      </w:pPr>
-      <w:r>
-        <w:rPr>
-          <w:rFonts w:ascii="Arial" w:hAnsi="Arial" w:cs="Arial"/>
-          <w:color w:val="4F81BD" w:themeColor="accent1"/>
-        </w:rPr>
-        <w:t>What is the minor allele frequency of the 10 variants in these new populations</w:t>
-      </w:r>
-      <w:r>
-        <w:rPr>
-          <w:rFonts w:ascii="Arial" w:hAnsi="Arial" w:cs="Arial"/>
-          <w:color w:val="4F81BD" w:themeColor="accent1"/>
-        </w:rPr>
-        <w:t>:</w:t>
-      </w:r>
-      <w:r>
-        <w:rPr>
-          <w:rFonts w:ascii="Arial" w:hAnsi="Arial" w:cs="Arial"/>
-          <w:color w:val="4F81BD" w:themeColor="accent1"/>
-        </w:rPr>
-        <w:t xml:space="preserve"> do you have data on this?</w:t>
-      </w:r>
-    </w:p>
-    <w:p>
-      <w:pPr>
-        <w:pStyle w:val="ListParagraph"/>
-        <w:numPr>
-          <w:ilvl w:val="0"/>
-          <w:numId w:val="2"/>
-        </w:numPr>
-        <w:shd w:val="clear" w:color="auto" w:fill="FFFFFF" w:themeFill="background1"/>
-        <w:rPr>
-          <w:rFonts w:ascii="Arial" w:hAnsi="Arial" w:cs="Arial"/>
-          <w:color w:val="4F81BD" w:themeColor="accent1"/>
-        </w:rPr>
-      </w:pPr>
-      <w:r>
-        <w:rPr>
-          <w:rFonts w:ascii="Arial" w:hAnsi="Arial" w:cs="Arial"/>
-          <w:color w:val="4F81BD" w:themeColor="accent1"/>
-        </w:rPr>
-        <w:t>Is the primary goal to replicate the 10 known variants, or to also discover new variants?</w:t>
-      </w:r>
-    </w:p>
-    <w:p>
-      <w:pPr>
-        <w:pStyle w:val="ListParagraph"/>
-        <w:rPr>
-          <w:rFonts w:ascii="Arial" w:hAnsi="Arial" w:cs="Arial"/>
-        </w:rPr>
-      </w:pPr>
-    </w:p>
-    <w:p>
-      <w:pPr>
-        <w:pStyle w:val="ListParagraph"/>
-        <w:numPr>
-          <w:ilvl w:val="0"/>
-          <w:numId w:val="1"/>
-        </w:numPr>
-        <w:rPr>
-          <w:rFonts w:ascii="Arial" w:hAnsi="Arial" w:cs="Arial"/>
-          <w:b/>
-        </w:rPr>
-      </w:pPr>
-      <w:r>
-        <w:rPr>
-          <w:rFonts w:ascii="Arial" w:hAnsi="Arial" w:cs="Arial"/>
-          <w:b/>
-        </w:rPr>
-        <w:t>P</w:t>
-      </w:r>
-      <w:r>
-        <w:rPr>
-          <w:rFonts w:ascii="Arial" w:hAnsi="Arial" w:cs="Arial"/>
-          <w:b/>
-        </w:rPr>
-        <w:t>atient outcomes in glaucoma therapy: drops vs. blebs</w:t>
-      </w:r>
-    </w:p>
-    <w:p>
-      <w:pPr>
-        <w:pStyle w:val="ListParagraph"/>
-        <w:rPr>
-          <w:rFonts w:ascii="Arial" w:hAnsi="Arial" w:cs="Arial"/>
-        </w:rPr>
-      </w:pPr>
-      <w:r>
-        <w:rPr>
-          <w:rFonts w:ascii="Arial" w:hAnsi="Arial" w:cs="Arial"/>
-        </w:rPr>
-        <w:t xml:space="preserve">Glaucoma is characterized by increased intraocular pressure that progressively destroys the optic nerve, leading to vision loss.  Treatments for glaucoma are centered on lowering intraocular pressure enough to stop nerve damage while maintaining high enough pressure to prevent macular folding and other adverse side effects.   The least invasive </w:t>
-      </w:r>
-      <w:r>
-        <w:rPr>
-          <w:rFonts w:ascii="Arial" w:hAnsi="Arial" w:cs="Arial"/>
-        </w:rPr>
-        <w:t xml:space="preserve">therapeutic approach is the prescription of eye drops, the most invasive is trabeculectomy, or surgical creation of an alternative drainage system (blebs), to allow fluid to leave the eye.  Trabeculectomy has a much higher success rate than eye drops, but because of the cost and invasiveness of surgery, most insurance plans require treatment with drops before moving to trabeculectomy.  </w:t>
-      </w:r>
-      <w:r>
-        <w:rPr>
-          <w:rFonts w:ascii="Arial" w:hAnsi="Arial" w:cs="Arial"/>
-        </w:rPr>
-        <w:t>Given the potentially rapid decline in optic nerve function with prolonged elevated intraocular pressures, we want to avoid using treatments that are likely to fail on the highest risk patients</w:t>
-      </w:r>
-      <w:r>
-        <w:rPr>
-          <w:rFonts w:ascii="Arial" w:hAnsi="Arial" w:cs="Arial"/>
-        </w:rPr>
-        <w:t xml:space="preserve"> and need evidence-based decision rules for the insurance companies</w:t>
-      </w:r>
-      <w:r>
-        <w:rPr>
-          <w:rFonts w:ascii="Arial" w:hAnsi="Arial" w:cs="Arial"/>
-        </w:rPr>
-        <w:t xml:space="preserve">.  </w:t>
-      </w:r>
-      <w:r>
-        <w:rPr>
-          <w:rFonts w:ascii="Arial" w:hAnsi="Arial" w:cs="Arial"/>
-        </w:rPr>
-        <w:t xml:space="preserve">We are planning a study to examine the </w:t>
-      </w:r>
-      <w:r>
-        <w:rPr>
-          <w:rFonts w:ascii="Arial" w:hAnsi="Arial" w:cs="Arial"/>
-        </w:rPr>
-        <w:t>clinical and demographic characteristics of the minority of patients who respond to eye drop therapy in order to better target that therapy to those most likely to have a positive treatment response.</w:t>
-      </w:r>
-      <w:r>
-        <w:rPr>
-          <w:rFonts w:ascii="Arial" w:hAnsi="Arial" w:cs="Arial"/>
-        </w:rPr>
-        <w:t xml:space="preserve">  We would like to talk to you about a study design and data analysis plan for this study as we prepare our grant application.  </w:t>
-      </w:r>
-    </w:p>
-    <w:p>
-      <w:pPr>
-        <w:pStyle w:val="ListParagraph"/>
-        <w:numPr>
-          <w:ilvl w:val="0"/>
-          <w:numId w:val="2"/>
-        </w:numPr>
-        <w:rPr>
-          <w:rFonts w:ascii="Arial" w:hAnsi="Arial" w:cs="Arial"/>
-          <w:color w:val="4F81BD" w:themeColor="accent1"/>
-        </w:rPr>
-      </w:pPr>
-      <w:r>
-        <w:rPr>
-          <w:rFonts w:ascii="Arial" w:hAnsi="Arial" w:cs="Arial"/>
-          <w:color w:val="4F81BD" w:themeColor="accent1"/>
-        </w:rPr>
-        <w:t>I</w:t>
-      </w:r>
-      <w:r>
-        <w:rPr>
-          <w:rFonts w:ascii="Arial" w:hAnsi="Arial" w:cs="Arial"/>
-          <w:color w:val="4F81BD" w:themeColor="accent1"/>
-        </w:rPr>
-        <w:t>s this a retrospective study using existing clinical records, or a prospective study?</w:t>
-      </w:r>
-    </w:p>
-    <w:p>
-      <w:pPr>
-        <w:pStyle w:val="ListParagraph"/>
-        <w:numPr>
-          <w:ilvl w:val="0"/>
-          <w:numId w:val="2"/>
-        </w:numPr>
-        <w:rPr>
-          <w:rFonts w:ascii="Arial" w:hAnsi="Arial" w:cs="Arial"/>
-          <w:color w:val="4F81BD" w:themeColor="accent1"/>
-        </w:rPr>
-      </w:pPr>
-      <w:r>
-        <w:rPr>
-          <w:rFonts w:ascii="Arial" w:hAnsi="Arial" w:cs="Arial"/>
-          <w:color w:val="4F81BD" w:themeColor="accent1"/>
-        </w:rPr>
-        <w:t xml:space="preserve">Primary outcome: </w:t>
-      </w:r>
-      <w:r>
-        <w:rPr>
-          <w:rFonts w:ascii="Arial" w:hAnsi="Arial" w:cs="Arial"/>
-          <w:color w:val="4F81BD" w:themeColor="accent1"/>
-        </w:rPr>
-        <w:t>treatment response (intraocular pressure reduction), time to treatment failure, visual field change?</w:t>
-      </w:r>
-    </w:p>
-    <w:p>
-      <w:pPr>
-        <w:pStyle w:val="ListParagraph"/>
-        <w:numPr>
-          <w:ilvl w:val="0"/>
-          <w:numId w:val="2"/>
-        </w:numPr>
-        <w:rPr>
-          <w:rFonts w:ascii="Arial" w:hAnsi="Arial" w:cs="Arial"/>
-          <w:color w:val="4F81BD" w:themeColor="accent1"/>
-        </w:rPr>
-      </w:pPr>
-      <w:r>
-        <w:rPr>
-          <w:rFonts w:ascii="Arial" w:hAnsi="Arial" w:cs="Arial"/>
-          <w:color w:val="4F81BD" w:themeColor="accent1"/>
-        </w:rPr>
-        <w:t>Clinically meaningful difference in eye pressure?</w:t>
-      </w:r>
-    </w:p>
-    <w:p>
-      <w:pPr>
-        <w:pStyle w:val="ListParagraph"/>
-        <w:numPr>
-          <w:ilvl w:val="0"/>
-          <w:numId w:val="2"/>
-        </w:numPr>
-        <w:rPr>
-          <w:rFonts w:ascii="Arial" w:hAnsi="Arial" w:cs="Arial"/>
-          <w:color w:val="4F81BD" w:themeColor="accent1"/>
-        </w:rPr>
-      </w:pPr>
-      <w:r>
-        <w:rPr>
-          <w:rFonts w:ascii="Arial" w:hAnsi="Arial" w:cs="Arial"/>
-          <w:color w:val="4F81BD" w:themeColor="accent1"/>
-        </w:rPr>
-        <w:t>Patient population: single clinic, health system, other?</w:t>
-      </w:r>
-    </w:p>
-    <w:p>
-      <w:pPr>
-        <w:pStyle w:val="ListParagraph"/>
-        <w:numPr>
-          <w:ilvl w:val="0"/>
-          <w:numId w:val="2"/>
-        </w:numPr>
-        <w:rPr>
-          <w:rFonts w:ascii="Arial" w:hAnsi="Arial" w:cs="Arial"/>
-          <w:color w:val="4F81BD" w:themeColor="accent1"/>
-        </w:rPr>
-      </w:pPr>
-      <w:r>
-        <w:rPr>
-          <w:rFonts w:ascii="Arial" w:hAnsi="Arial" w:cs="Arial"/>
-          <w:color w:val="4F81BD" w:themeColor="accent1"/>
-        </w:rPr>
-        <w:t>How will you handle patients who were switched from drops to surgery during follow-up?</w:t>
-      </w:r>
-    </w:p>
-    <w:p>
-      <w:pPr>
-        <w:pStyle w:val="ListParagraph"/>
-        <w:rPr>
-          <w:rFonts w:ascii="Arial" w:hAnsi="Arial" w:cs="Arial"/>
-        </w:rPr>
-      </w:pPr>
-    </w:p>
-    <w:p>
-      <w:pPr>
-        <w:pStyle w:val="ListParagraph"/>
-        <w:numPr>
-          <w:ilvl w:val="0"/>
-          <w:numId w:val="1"/>
-        </w:numPr>
-        <w:rPr>
-          <w:rFonts w:ascii="Arial" w:hAnsi="Arial" w:cs="Arial"/>
-          <w:b/>
-        </w:rPr>
-      </w:pPr>
-      <w:r>
-        <w:rPr>
-          <w:rFonts w:ascii="Arial" w:hAnsi="Arial" w:cs="Arial"/>
-          <w:b/>
-        </w:rPr>
         <w:t xml:space="preserve">Emergency Room utilization in an Urban Level 1 </w:t>
       </w:r>
       <w:r>
@@ -1331,14 +1586,7 @@
         <w:rPr>
           <w:rFonts w:ascii="Arial" w:hAnsi="Arial" w:cs="Arial"/>
         </w:rPr>
-        <w:t xml:space="preserve">.  There are a number of domains that we need to cover in terms of evaluation, </w:t>
-      </w:r>
-      <w:r>
-        <w:rPr>
-          <w:rFonts w:ascii="Arial" w:hAnsi="Arial" w:cs="Arial"/>
-        </w:rPr>
-        <w:lastRenderedPageBreak/>
-        <w:t xml:space="preserve">including patient, provider and community stakeholders. </w:t>
+        <w:t xml:space="preserve">.  There are a number of domains that we need to cover in terms of evaluation, including patient, provider and community stakeholders. </w:t>
       </w:r>
       <w:r>
         <w:rPr>
@@ -1604,7 +1852,7 @@
         <w:rFonts w:ascii="Arial" w:eastAsiaTheme="minorHAnsi" w:hAnsi="Arial" w:cs="Arial" w:hint="default"/>
       </w:rPr>
     </w:lvl>
-    <w:lvl w:ilvl="1" w:tplc="04090003" w:tentative="1">
+    <w:lvl w:ilvl="1" w:tplc="04090003">
       <w:start w:val="1"/>
       <w:numFmt w:val="bullet"/>
       <w:lvlText w:val="o"/>

</xml_diff>